<commit_message>
Updated tables, manuscript, supplement and letter
</commit_message>
<xml_diff>
--- a/Manuscript/Revision/Letter.docx
+++ b/Manuscript/Revision/Letter.docx
@@ -37,7 +37,7 @@
           <w:noProof/>
           <w:sz w:val="20"/>
         </w:rPr>
-        <w:t>June 25, 2025</w:t>
+        <w:t>June 30, 2025</w:t>
       </w:r>
       <w:r>
         <w:rPr>
@@ -361,7 +361,7 @@
           <w:sz w:val="20"/>
           <w:szCs w:val="20"/>
         </w:rPr>
-        <w:t xml:space="preserve"> I would like to point out that both reviewers focussed heavily on the seagrass part of the story, which is </w:t>
+        <w:t xml:space="preserve"> </w:t>
       </w:r>
       <w:r>
         <w:rPr>
@@ -370,7 +370,7 @@
           <w:sz w:val="20"/>
           <w:szCs w:val="20"/>
         </w:rPr>
-        <w:t xml:space="preserve">not the focus </w:t>
+        <w:t>I have</w:t>
       </w:r>
       <w:r>
         <w:rPr>
@@ -379,7 +379,97 @@
           <w:sz w:val="20"/>
           <w:szCs w:val="20"/>
         </w:rPr>
-        <w:t>of the manuscript. The story here is a much more fundamental one and concerns all plants.</w:t>
+        <w:t xml:space="preserve"> also taken the opportunity to improve the analysis to predict for unobserved seagrasses</w:t>
+      </w:r>
+      <w:r>
+        <w:rPr>
+          <w:rFonts w:ascii="Futura Medium" w:hAnsi="Futura Medium" w:cs="Futura Medium"/>
+          <w:color w:val="auto"/>
+          <w:sz w:val="20"/>
+          <w:szCs w:val="20"/>
+        </w:rPr>
+        <w:t xml:space="preserve"> and extend my </w:t>
+      </w:r>
+      <w:r>
+        <w:rPr>
+          <w:rFonts w:ascii="Futura Medium" w:hAnsi="Futura Medium" w:cs="Futura Medium"/>
+          <w:color w:val="auto"/>
+          <w:sz w:val="20"/>
+          <w:szCs w:val="20"/>
+        </w:rPr>
+        <w:t>conclusions</w:t>
+      </w:r>
+      <w:r>
+        <w:rPr>
+          <w:rFonts w:ascii="Futura Medium" w:hAnsi="Futura Medium" w:cs="Futura Medium"/>
+          <w:color w:val="auto"/>
+          <w:sz w:val="20"/>
+          <w:szCs w:val="20"/>
+        </w:rPr>
+        <w:t xml:space="preserve">. </w:t>
+      </w:r>
+      <w:r>
+        <w:rPr>
+          <w:rFonts w:ascii="Futura Medium" w:hAnsi="Futura Medium" w:cs="Futura Medium"/>
+          <w:color w:val="auto"/>
+          <w:sz w:val="20"/>
+          <w:szCs w:val="20"/>
+        </w:rPr>
+        <w:t xml:space="preserve">I would like to point out that both reviewers focussed heavily on the seagrass part of the story, which </w:t>
+      </w:r>
+      <w:r>
+        <w:rPr>
+          <w:rFonts w:ascii="Futura Medium" w:hAnsi="Futura Medium" w:cs="Futura Medium"/>
+          <w:color w:val="auto"/>
+          <w:sz w:val="20"/>
+          <w:szCs w:val="20"/>
+        </w:rPr>
+        <w:t xml:space="preserve">occupies less than half of the manuscript and </w:t>
+      </w:r>
+      <w:r>
+        <w:rPr>
+          <w:rFonts w:ascii="Futura Medium" w:hAnsi="Futura Medium" w:cs="Futura Medium"/>
+          <w:color w:val="auto"/>
+          <w:sz w:val="20"/>
+          <w:szCs w:val="20"/>
+        </w:rPr>
+        <w:t xml:space="preserve">is </w:t>
+      </w:r>
+      <w:r>
+        <w:rPr>
+          <w:rFonts w:ascii="Futura Medium" w:hAnsi="Futura Medium" w:cs="Futura Medium"/>
+          <w:color w:val="auto"/>
+          <w:sz w:val="20"/>
+          <w:szCs w:val="20"/>
+        </w:rPr>
+        <w:t xml:space="preserve">not </w:t>
+      </w:r>
+      <w:r>
+        <w:rPr>
+          <w:rFonts w:ascii="Futura Medium" w:hAnsi="Futura Medium" w:cs="Futura Medium"/>
+          <w:color w:val="auto"/>
+          <w:sz w:val="20"/>
+          <w:szCs w:val="20"/>
+        </w:rPr>
+        <w:t>its</w:t>
+      </w:r>
+      <w:r>
+        <w:rPr>
+          <w:rFonts w:ascii="Futura Medium" w:hAnsi="Futura Medium" w:cs="Futura Medium"/>
+          <w:color w:val="auto"/>
+          <w:sz w:val="20"/>
+          <w:szCs w:val="20"/>
+        </w:rPr>
+        <w:t xml:space="preserve"> focus</w:t>
+      </w:r>
+      <w:r>
+        <w:rPr>
+          <w:rFonts w:ascii="Futura Medium" w:hAnsi="Futura Medium" w:cs="Futura Medium"/>
+          <w:color w:val="auto"/>
+          <w:sz w:val="20"/>
+          <w:szCs w:val="20"/>
+        </w:rPr>
+        <w:t>. The story here is a much more fundamental one and concerns all plants.</w:t>
       </w:r>
     </w:p>
     <w:p>
@@ -500,17 +590,64 @@
           <w:sz w:val="20"/>
           <w:szCs w:val="20"/>
         </w:rPr>
-        <w:t xml:space="preserve"> a similar article published on your journal:</w:t>
-      </w:r>
-      <w:r>
-        <w:rPr>
-          <w:rFonts w:ascii="Futura Medium" w:hAnsi="Futura Medium" w:cs="Futura Medium" w:hint="cs"/>
+        <w:t xml:space="preserve"> a similar article published </w:t>
+      </w:r>
+      <w:r>
+        <w:rPr>
+          <w:rFonts w:ascii="Futura Medium" w:hAnsi="Futura Medium" w:cs="Futura Medium"/>
           <w:color w:val="auto"/>
           <w:sz w:val="20"/>
           <w:szCs w:val="20"/>
         </w:rPr>
+        <w:t>in</w:t>
+      </w:r>
+      <w:r>
+        <w:rPr>
+          <w:rFonts w:ascii="Futura Medium" w:hAnsi="Futura Medium" w:cs="Futura Medium"/>
+          <w:color w:val="auto"/>
+          <w:sz w:val="20"/>
+          <w:szCs w:val="20"/>
+        </w:rPr>
+        <w:t xml:space="preserve"> your journal</w:t>
+      </w:r>
+      <w:r>
+        <w:rPr>
+          <w:rFonts w:ascii="Futura Medium" w:hAnsi="Futura Medium" w:cs="Futura Medium"/>
+          <w:color w:val="auto"/>
+          <w:sz w:val="20"/>
+          <w:szCs w:val="20"/>
+        </w:rPr>
+        <w:t xml:space="preserve"> recently</w:t>
+      </w:r>
+      <w:r>
+        <w:rPr>
+          <w:rFonts w:ascii="Futura Medium" w:hAnsi="Futura Medium" w:cs="Futura Medium"/>
+          <w:color w:val="auto"/>
+          <w:sz w:val="20"/>
+          <w:szCs w:val="20"/>
+        </w:rPr>
+        <w:t>:</w:t>
+      </w:r>
+      <w:r>
+        <w:rPr>
+          <w:rFonts w:ascii="Futura Medium" w:hAnsi="Futura Medium" w:cs="Futura Medium" w:hint="cs"/>
+          <w:color w:val="auto"/>
+          <w:sz w:val="20"/>
+          <w:szCs w:val="20"/>
+        </w:rPr>
         <w:t xml:space="preserve"> </w:t>
       </w:r>
+    </w:p>
+    <w:p>
+      <w:pPr>
+        <w:pStyle w:val="Default"/>
+        <w:rPr>
+          <w:rFonts w:ascii="Futura Medium" w:hAnsi="Futura Medium" w:cs="Futura Medium"/>
+          <w:color w:val="auto"/>
+          <w:sz w:val="20"/>
+          <w:szCs w:val="20"/>
+        </w:rPr>
+      </w:pPr>
       <w:r>
         <w:rPr>
           <w:rFonts w:ascii="Futura Medium" w:hAnsi="Futura Medium" w:cs="Futura Medium" w:hint="cs"/>
@@ -650,14 +787,21 @@
           <w:rFonts w:ascii="Futura Medium" w:hAnsi="Futura Medium" w:cs="Futura Medium"/>
           <w:sz w:val="20"/>
         </w:rPr>
-        <w:t>, now</w:t>
-      </w:r>
-      <w:r>
-        <w:rPr>
-          <w:rFonts w:ascii="Futura Medium" w:hAnsi="Futura Medium" w:cs="Futura Medium" w:hint="cs"/>
-          <w:sz w:val="20"/>
-        </w:rPr>
-        <w:t xml:space="preserve"> at </w:t>
+        <w:t xml:space="preserve">, </w:t>
+      </w:r>
+      <w:r>
+        <w:rPr>
+          <w:rFonts w:ascii="Futura Medium" w:hAnsi="Futura Medium" w:cs="Futura Medium"/>
+          <w:sz w:val="20"/>
+        </w:rPr>
+        <w:t>which I renamed</w:t>
+      </w:r>
+      <w:r>
+        <w:rPr>
+          <w:rFonts w:ascii="Futura Medium" w:hAnsi="Futura Medium" w:cs="Futura Medium" w:hint="cs"/>
+          <w:sz w:val="20"/>
+        </w:rPr>
+        <w:t xml:space="preserve"> </w:t>
       </w:r>
       <w:hyperlink r:id="rId12" w:history="1">
         <w:r>
@@ -1149,34 +1293,119 @@
           <w:rFonts w:ascii="Futura Medium" w:hAnsi="Futura Medium" w:cs="Futura Medium"/>
           <w:sz w:val="20"/>
         </w:rPr>
-        <w:t>(p. 7, ll. 2, 4f., 11–15, 17, 22, p. 10, l. 3, p. 12, ll. 16–22, p. 13, ll. 3ff.).</w:t>
-      </w:r>
-    </w:p>
-    <w:p>
-      <w:pPr>
-        <w:jc w:val="left"/>
-        <w:rPr>
-          <w:rFonts w:ascii="Futura Medium" w:hAnsi="Futura Medium" w:cs="Futura Medium"/>
-          <w:color w:val="808080" w:themeColor="background1" w:themeShade="80"/>
-          <w:sz w:val="20"/>
-        </w:rPr>
-      </w:pPr>
-    </w:p>
-    <w:p>
-      <w:pPr>
-        <w:jc w:val="left"/>
-        <w:rPr>
-          <w:rFonts w:ascii="Futura Medium" w:hAnsi="Futura Medium" w:cs="Futura Medium"/>
-          <w:color w:val="808080" w:themeColor="background1" w:themeShade="80"/>
-          <w:sz w:val="20"/>
-        </w:rPr>
-      </w:pPr>
-      <w:r>
-        <w:rPr>
-          <w:rFonts w:ascii="Futura Medium" w:hAnsi="Futura Medium" w:cs="Futura Medium" w:hint="cs"/>
-          <w:color w:val="808080" w:themeColor="background1" w:themeShade="80"/>
-          <w:sz w:val="20"/>
-        </w:rPr>
+        <w:t xml:space="preserve">(p. 7, ll. 2, 4f., 11–15, 17, 22, p. 10, l. 3, </w:t>
+      </w:r>
+      <w:r>
+        <w:rPr>
+          <w:rFonts w:ascii="Futura Medium" w:hAnsi="Futura Medium" w:cs="Futura Medium"/>
+          <w:sz w:val="20"/>
+        </w:rPr>
+        <w:t xml:space="preserve">p. 11, ll. 20ff., </w:t>
+      </w:r>
+      <w:r>
+        <w:rPr>
+          <w:rFonts w:ascii="Futura Medium" w:hAnsi="Futura Medium" w:cs="Futura Medium"/>
+          <w:sz w:val="20"/>
+        </w:rPr>
+        <w:t xml:space="preserve">p. 12, ll. </w:t>
+      </w:r>
+      <w:r>
+        <w:rPr>
+          <w:rFonts w:ascii="Futura Medium" w:hAnsi="Futura Medium" w:cs="Futura Medium"/>
+          <w:sz w:val="20"/>
+        </w:rPr>
+        <w:t xml:space="preserve">11, </w:t>
+      </w:r>
+      <w:r>
+        <w:rPr>
+          <w:rFonts w:ascii="Futura Medium" w:hAnsi="Futura Medium" w:cs="Futura Medium"/>
+          <w:sz w:val="20"/>
+        </w:rPr>
+        <w:t>1</w:t>
+      </w:r>
+      <w:r>
+        <w:rPr>
+          <w:rFonts w:ascii="Futura Medium" w:hAnsi="Futura Medium" w:cs="Futura Medium"/>
+          <w:sz w:val="20"/>
+        </w:rPr>
+        <w:t>4</w:t>
+      </w:r>
+      <w:r>
+        <w:rPr>
+          <w:rFonts w:ascii="Futura Medium" w:hAnsi="Futura Medium" w:cs="Futura Medium"/>
+          <w:sz w:val="20"/>
+        </w:rPr>
+        <w:t>–2</w:t>
+      </w:r>
+      <w:r>
+        <w:rPr>
+          <w:rFonts w:ascii="Futura Medium" w:hAnsi="Futura Medium" w:cs="Futura Medium"/>
+          <w:sz w:val="20"/>
+        </w:rPr>
+        <w:t>0</w:t>
+      </w:r>
+      <w:r>
+        <w:rPr>
+          <w:rFonts w:ascii="Futura Medium" w:hAnsi="Futura Medium" w:cs="Futura Medium"/>
+          <w:sz w:val="20"/>
+        </w:rPr>
+        <w:t xml:space="preserve">, p. 13, ll. </w:t>
+      </w:r>
+      <w:r>
+        <w:rPr>
+          <w:rFonts w:ascii="Futura Medium" w:hAnsi="Futura Medium" w:cs="Futura Medium"/>
+          <w:sz w:val="20"/>
+        </w:rPr>
+        <w:t>1</w:t>
+      </w:r>
+      <w:r>
+        <w:rPr>
+          <w:rFonts w:ascii="Futura Medium" w:hAnsi="Futura Medium" w:cs="Futura Medium"/>
+          <w:sz w:val="20"/>
+        </w:rPr>
+        <w:t>ff.</w:t>
+      </w:r>
+      <w:r>
+        <w:rPr>
+          <w:rFonts w:ascii="Futura Medium" w:hAnsi="Futura Medium" w:cs="Futura Medium"/>
+          <w:sz w:val="20"/>
+        </w:rPr>
+        <w:t>, p. 15, ll. 16, 19f.</w:t>
+      </w:r>
+      <w:r>
+        <w:rPr>
+          <w:rFonts w:ascii="Futura Medium" w:hAnsi="Futura Medium" w:cs="Futura Medium"/>
+          <w:sz w:val="20"/>
+        </w:rPr>
+        <w:t>).</w:t>
+      </w:r>
+    </w:p>
+    <w:p>
+      <w:pPr>
+        <w:jc w:val="left"/>
+        <w:rPr>
+          <w:rFonts w:ascii="Futura Medium" w:hAnsi="Futura Medium" w:cs="Futura Medium"/>
+          <w:color w:val="808080" w:themeColor="background1" w:themeShade="80"/>
+          <w:sz w:val="20"/>
+        </w:rPr>
+      </w:pPr>
+    </w:p>
+    <w:p>
+      <w:pPr>
+        <w:jc w:val="left"/>
+        <w:rPr>
+          <w:rFonts w:ascii="Futura Medium" w:hAnsi="Futura Medium" w:cs="Futura Medium"/>
+          <w:color w:val="808080" w:themeColor="background1" w:themeShade="80"/>
+          <w:sz w:val="20"/>
+        </w:rPr>
+      </w:pPr>
+      <w:r>
+        <w:rPr>
+          <w:rFonts w:ascii="Futura Medium" w:hAnsi="Futura Medium" w:cs="Futura Medium" w:hint="cs"/>
+          <w:color w:val="808080" w:themeColor="background1" w:themeShade="80"/>
+          <w:sz w:val="20"/>
+        </w:rPr>
+        <w:lastRenderedPageBreak/>
         <w:t>The reviewers also provide further details to help improve the manuscript that you may find useful.</w:t>
       </w:r>
       <w:r>
@@ -1201,7 +1430,6 @@
           <w:rFonts w:ascii="Futura Medium" w:hAnsi="Futura Medium" w:cs="Futura Medium"/>
           <w:sz w:val="20"/>
         </w:rPr>
-        <w:lastRenderedPageBreak/>
         <w:t>I have incorporated additional suggestions (see below).</w:t>
       </w:r>
     </w:p>
@@ -1456,14 +1684,21 @@
           <w:rFonts w:ascii="Futura Medium" w:hAnsi="Futura Medium" w:cs="Futura Medium"/>
           <w:sz w:val="20"/>
         </w:rPr>
-        <w:t>6</w:t>
-      </w:r>
-      <w:r>
-        <w:rPr>
-          <w:rFonts w:ascii="Futura Medium" w:hAnsi="Futura Medium" w:cs="Futura Medium"/>
-          <w:sz w:val="20"/>
-        </w:rPr>
-        <w:t>–22</w:t>
+        <w:t>4</w:t>
+      </w:r>
+      <w:r>
+        <w:rPr>
+          <w:rFonts w:ascii="Futura Medium" w:hAnsi="Futura Medium" w:cs="Futura Medium"/>
+          <w:sz w:val="20"/>
+        </w:rPr>
+        <w:t>–2</w:t>
+      </w:r>
+      <w:r>
+        <w:rPr>
+          <w:rFonts w:ascii="Futura Medium" w:hAnsi="Futura Medium" w:cs="Futura Medium"/>
+          <w:sz w:val="20"/>
+        </w:rPr>
+        <w:t>0</w:t>
       </w:r>
       <w:r>
         <w:rPr>
@@ -1627,7 +1862,7 @@
           <w:rFonts w:ascii="Futura Medium" w:hAnsi="Futura Medium" w:cs="Futura Medium"/>
           <w:sz w:val="20"/>
         </w:rPr>
-        <w:t xml:space="preserve"> 16–22</w:t>
+        <w:t xml:space="preserve"> 14–20</w:t>
       </w:r>
       <w:r>
         <w:rPr>
@@ -1784,28 +2019,14 @@
           <w:rFonts w:ascii="Futura Medium" w:hAnsi="Futura Medium" w:cs="Futura Medium"/>
           <w:sz w:val="20"/>
         </w:rPr>
-        <w:t xml:space="preserve"> (p. 3, l</w:t>
-      </w:r>
-      <w:r>
-        <w:rPr>
-          <w:rFonts w:ascii="Futura Medium" w:hAnsi="Futura Medium" w:cs="Futura Medium"/>
-          <w:sz w:val="20"/>
-        </w:rPr>
-        <w:t>l</w:t>
-      </w:r>
-      <w:r>
-        <w:rPr>
-          <w:rFonts w:ascii="Futura Medium" w:hAnsi="Futura Medium" w:cs="Futura Medium"/>
-          <w:sz w:val="20"/>
-        </w:rPr>
-        <w:t xml:space="preserve">. </w:t>
-      </w:r>
-      <w:r>
-        <w:rPr>
-          <w:rFonts w:ascii="Futura Medium" w:hAnsi="Futura Medium" w:cs="Futura Medium"/>
-          <w:sz w:val="20"/>
-        </w:rPr>
-        <w:t>19f.</w:t>
+        <w:t xml:space="preserve"> (p. 3, l. </w:t>
+      </w:r>
+      <w:r>
+        <w:rPr>
+          <w:rFonts w:ascii="Futura Medium" w:hAnsi="Futura Medium" w:cs="Futura Medium"/>
+          <w:sz w:val="20"/>
+        </w:rPr>
+        <w:t>20</w:t>
       </w:r>
       <w:r>
         <w:rPr>
@@ -1840,16 +2061,8 @@
           <w:color w:val="808080" w:themeColor="background1" w:themeShade="80"/>
           <w:sz w:val="20"/>
         </w:rPr>
-        <w:t xml:space="preserve">So, it is essential to explain the definition of “detritus” in more detail and in plain words. In this context, I would also like to mention that I am not a “hard-core” plant (or seaweed) physiologist, which </w:t>
-      </w:r>
-      <w:r>
-        <w:rPr>
-          <w:rFonts w:ascii="Futura Medium" w:hAnsi="Futura Medium" w:cs="Futura Medium" w:hint="cs"/>
-          <w:color w:val="808080" w:themeColor="background1" w:themeShade="80"/>
-          <w:sz w:val="20"/>
-        </w:rPr>
         <w:lastRenderedPageBreak/>
-        <w:t xml:space="preserve">is why I have urged the editors to seek the advice of a terrestrial plant physiologist </w:t>
+        <w:t xml:space="preserve">So, it is essential to explain the definition of “detritus” in more detail and in plain words. In this context, I would also like to mention that I am not a “hard-core” plant (or seaweed) physiologist, which is why I have urged the editors to seek the advice of a terrestrial plant physiologist </w:t>
       </w:r>
       <w:proofErr w:type="gramStart"/>
       <w:r>
@@ -2006,7 +2219,28 @@
           <w:rFonts w:ascii="Futura Medium" w:hAnsi="Futura Medium" w:cs="Futura Medium"/>
           <w:sz w:val="20"/>
         </w:rPr>
-        <w:t xml:space="preserve"> 16–22</w:t>
+        <w:t xml:space="preserve"> 1</w:t>
+      </w:r>
+      <w:r>
+        <w:rPr>
+          <w:rFonts w:ascii="Futura Medium" w:hAnsi="Futura Medium" w:cs="Futura Medium"/>
+          <w:sz w:val="20"/>
+        </w:rPr>
+        <w:t>4</w:t>
+      </w:r>
+      <w:r>
+        <w:rPr>
+          <w:rFonts w:ascii="Futura Medium" w:hAnsi="Futura Medium" w:cs="Futura Medium"/>
+          <w:sz w:val="20"/>
+        </w:rPr>
+        <w:t>–2</w:t>
+      </w:r>
+      <w:r>
+        <w:rPr>
+          <w:rFonts w:ascii="Futura Medium" w:hAnsi="Futura Medium" w:cs="Futura Medium"/>
+          <w:sz w:val="20"/>
+        </w:rPr>
+        <w:t>0</w:t>
       </w:r>
       <w:r>
         <w:rPr>
@@ -2283,7 +2517,28 @@
           <w:rFonts w:ascii="Futura Medium" w:hAnsi="Futura Medium" w:cs="Futura Medium"/>
           <w:sz w:val="20"/>
         </w:rPr>
-        <w:t xml:space="preserve"> 16–22</w:t>
+        <w:t xml:space="preserve"> 1</w:t>
+      </w:r>
+      <w:r>
+        <w:rPr>
+          <w:rFonts w:ascii="Futura Medium" w:hAnsi="Futura Medium" w:cs="Futura Medium"/>
+          <w:sz w:val="20"/>
+        </w:rPr>
+        <w:t>4</w:t>
+      </w:r>
+      <w:r>
+        <w:rPr>
+          <w:rFonts w:ascii="Futura Medium" w:hAnsi="Futura Medium" w:cs="Futura Medium"/>
+          <w:sz w:val="20"/>
+        </w:rPr>
+        <w:t>–2</w:t>
+      </w:r>
+      <w:r>
+        <w:rPr>
+          <w:rFonts w:ascii="Futura Medium" w:hAnsi="Futura Medium" w:cs="Futura Medium"/>
+          <w:sz w:val="20"/>
+        </w:rPr>
+        <w:t>0</w:t>
       </w:r>
       <w:r>
         <w:rPr>
@@ -2510,7 +2765,7 @@
           <w:rFonts w:ascii="Futura Medium" w:hAnsi="Futura Medium" w:cs="Futura Medium"/>
           <w:sz w:val="20"/>
         </w:rPr>
-        <w:t>3</w:t>
+        <w:t>1</w:t>
       </w:r>
       <w:r>
         <w:rPr>
@@ -2687,7 +2942,15 @@
           <w:rFonts w:ascii="Futura Medium" w:hAnsi="Futura Medium" w:cs="Futura Medium"/>
           <w:sz w:val="20"/>
         </w:rPr>
-        <w:t xml:space="preserve"> g</w:t>
+        <w:t xml:space="preserve"> </w:t>
+      </w:r>
+      <w:r>
+        <w:rPr>
+          <w:rFonts w:ascii="Futura Medium" w:hAnsi="Futura Medium" w:cs="Futura Medium"/>
+          <w:sz w:val="20"/>
+        </w:rPr>
+        <w:lastRenderedPageBreak/>
+        <w:t>g</w:t>
       </w:r>
       <w:r>
         <w:rPr>
@@ -2887,15 +3150,7 @@
           <w:rFonts w:ascii="Futura Medium" w:hAnsi="Futura Medium" w:cs="Futura Medium"/>
           <w:sz w:val="20"/>
         </w:rPr>
-        <w:t xml:space="preserve"> leaf mass </w:t>
-      </w:r>
-      <w:r>
-        <w:rPr>
-          <w:rFonts w:ascii="Futura Medium" w:hAnsi="Futura Medium" w:cs="Futura Medium"/>
-          <w:sz w:val="20"/>
-        </w:rPr>
-        <w:lastRenderedPageBreak/>
-        <w:t xml:space="preserve">per area </w:t>
+        <w:t xml:space="preserve"> leaf mass per area </w:t>
       </w:r>
       <w:r>
         <w:rPr>
@@ -3167,7 +3422,7 @@
           <w:rFonts w:ascii="Futura Medium" w:hAnsi="Futura Medium" w:cs="Futura Medium"/>
           <w:sz w:val="20"/>
         </w:rPr>
-        <w:t>21</w:t>
+        <w:t>18</w:t>
       </w:r>
       <w:r>
         <w:rPr>
@@ -3195,7 +3450,21 @@
           <w:rFonts w:ascii="Futura Medium" w:hAnsi="Futura Medium" w:cs="Futura Medium"/>
           <w:sz w:val="20"/>
         </w:rPr>
-        <w:t>l. 10–14</w:t>
+        <w:t xml:space="preserve">l. </w:t>
+      </w:r>
+      <w:r>
+        <w:rPr>
+          <w:rFonts w:ascii="Futura Medium" w:hAnsi="Futura Medium" w:cs="Futura Medium"/>
+          <w:sz w:val="20"/>
+        </w:rPr>
+        <w:t>8</w:t>
+      </w:r>
+      <w:r>
+        <w:rPr>
+          <w:rFonts w:ascii="Futura Medium" w:hAnsi="Futura Medium" w:cs="Futura Medium"/>
+          <w:sz w:val="20"/>
+        </w:rPr>
+        <w:t>ff.</w:t>
       </w:r>
       <w:r>
         <w:rPr>
@@ -3354,7 +3623,28 @@
           <w:rFonts w:ascii="Futura Medium" w:hAnsi="Futura Medium" w:cs="Futura Medium"/>
           <w:sz w:val="20"/>
         </w:rPr>
-        <w:t xml:space="preserve"> 16–22</w:t>
+        <w:t xml:space="preserve"> 1</w:t>
+      </w:r>
+      <w:r>
+        <w:rPr>
+          <w:rFonts w:ascii="Futura Medium" w:hAnsi="Futura Medium" w:cs="Futura Medium"/>
+          <w:sz w:val="20"/>
+        </w:rPr>
+        <w:t>4</w:t>
+      </w:r>
+      <w:r>
+        <w:rPr>
+          <w:rFonts w:ascii="Futura Medium" w:hAnsi="Futura Medium" w:cs="Futura Medium"/>
+          <w:sz w:val="20"/>
+        </w:rPr>
+        <w:t>–2</w:t>
+      </w:r>
+      <w:r>
+        <w:rPr>
+          <w:rFonts w:ascii="Futura Medium" w:hAnsi="Futura Medium" w:cs="Futura Medium"/>
+          <w:sz w:val="20"/>
+        </w:rPr>
+        <w:t>0</w:t>
       </w:r>
       <w:r>
         <w:rPr>
@@ -4237,7 +4527,15 @@
           <w:rFonts w:ascii="Futura Medium" w:hAnsi="Futura Medium" w:cs="Futura Medium"/>
           <w:sz w:val="20"/>
         </w:rPr>
-        <w:t xml:space="preserve"> and then exposed them to over 1000 </w:t>
+        <w:t xml:space="preserve"> and then exposed them </w:t>
+      </w:r>
+      <w:r>
+        <w:rPr>
+          <w:rFonts w:ascii="Futura Medium" w:hAnsi="Futura Medium" w:cs="Futura Medium"/>
+          <w:sz w:val="20"/>
+        </w:rPr>
+        <w:lastRenderedPageBreak/>
+        <w:t xml:space="preserve">to over 1000 </w:t>
       </w:r>
       <w:bookmarkStart w:id="6" w:name="OLE_LINK6"/>
       <w:r>
@@ -4333,15 +4631,7 @@
           <w:rFonts w:ascii="Futura Medium" w:hAnsi="Futura Medium" w:cs="Futura Medium"/>
           <w:sz w:val="20"/>
         </w:rPr>
-        <w:t xml:space="preserve">and were able to measure practically unchanged </w:t>
-      </w:r>
-      <w:r>
-        <w:rPr>
-          <w:rFonts w:ascii="Futura Medium" w:hAnsi="Futura Medium" w:cs="Futura Medium"/>
-          <w:sz w:val="20"/>
-        </w:rPr>
-        <w:lastRenderedPageBreak/>
-        <w:t xml:space="preserve">maximal photosynthesis in fragments that had been kept in complete darkness </w:t>
+        <w:t xml:space="preserve">and were able to measure practically unchanged maximal photosynthesis in fragments that had been kept in complete darkness </w:t>
       </w:r>
       <w:r>
         <w:rPr>
@@ -4922,7 +5212,14 @@
           <w:rFonts w:ascii="Futura Medium" w:hAnsi="Futura Medium" w:cs="Futura Medium"/>
           <w:sz w:val="20"/>
         </w:rPr>
-        <w:t>16</w:t>
+        <w:t>1</w:t>
+      </w:r>
+      <w:r>
+        <w:rPr>
+          <w:rFonts w:ascii="Futura Medium" w:hAnsi="Futura Medium" w:cs="Futura Medium"/>
+          <w:sz w:val="20"/>
+        </w:rPr>
+        <w:t>7</w:t>
       </w:r>
       <w:r>
         <w:rPr>
@@ -5117,7 +5414,15 @@
           <w:rFonts w:ascii="Futura Medium" w:hAnsi="Futura Medium" w:cs="Futura Medium"/>
           <w:sz w:val="20"/>
         </w:rPr>
-        <w:t xml:space="preserve">matter what tissue is photosynthesising. It would be highly unlikely to assume that only newly grown tissue photosynthesises since data never show an </w:t>
+        <w:t xml:space="preserve">matter what tissue is photosynthesising. It would be highly unlikely to </w:t>
+      </w:r>
+      <w:r>
+        <w:rPr>
+          <w:rFonts w:ascii="Futura Medium" w:hAnsi="Futura Medium" w:cs="Futura Medium"/>
+          <w:sz w:val="20"/>
+        </w:rPr>
+        <w:lastRenderedPageBreak/>
+        <w:t xml:space="preserve">assume that only newly grown tissue photosynthesises since data never show an </w:t>
       </w:r>
       <w:r>
         <w:rPr>
@@ -5189,7 +5494,6 @@
           <w:color w:val="808080" w:themeColor="background1" w:themeShade="80"/>
           <w:sz w:val="20"/>
         </w:rPr>
-        <w:lastRenderedPageBreak/>
         <w:t xml:space="preserve">This is probably what the author refers to when he suggests (citing a previous reviewer) that “…since macroalgae are much less differentiated than higher plants and, thus, there is no reason why the single cell shouldn’t be able to continue its activity for a while…”. The question is which specific tissue is doing the </w:t>
       </w:r>
       <w:proofErr w:type="spellStart"/>
@@ -5693,7 +5997,14 @@
           <w:rFonts w:ascii="Futura Medium" w:hAnsi="Futura Medium" w:cs="Futura Medium"/>
           <w:sz w:val="20"/>
         </w:rPr>
-        <w:t>17</w:t>
+        <w:t>1</w:t>
+      </w:r>
+      <w:r>
+        <w:rPr>
+          <w:rFonts w:ascii="Futura Medium" w:hAnsi="Futura Medium" w:cs="Futura Medium"/>
+          <w:sz w:val="20"/>
+        </w:rPr>
+        <w:t>3</w:t>
       </w:r>
       <w:r>
         <w:rPr>
@@ -6056,7 +6367,14 @@
           <w:rFonts w:ascii="Futura Medium" w:hAnsi="Futura Medium" w:cs="Futura Medium"/>
           <w:sz w:val="20"/>
         </w:rPr>
-        <w:t>9ff.</w:t>
+        <w:t>7</w:t>
+      </w:r>
+      <w:r>
+        <w:rPr>
+          <w:rFonts w:ascii="Futura Medium" w:hAnsi="Futura Medium" w:cs="Futura Medium"/>
+          <w:sz w:val="20"/>
+        </w:rPr>
+        <w:t>ff.</w:t>
       </w:r>
       <w:r>
         <w:rPr>
@@ -6115,6 +6433,7 @@
           <w:rFonts w:ascii="Futura Medium" w:hAnsi="Futura Medium" w:cs="Futura Medium"/>
           <w:sz w:val="20"/>
         </w:rPr>
+        <w:lastRenderedPageBreak/>
         <w:t xml:space="preserve">As Prof. Thiel mentions I already discuss this in the results and I have added further mention of microorganisms and periphyton </w:t>
       </w:r>
       <w:r>
@@ -6157,7 +6476,7 @@
           <w:rFonts w:ascii="Futura Medium" w:hAnsi="Futura Medium" w:cs="Futura Medium"/>
           <w:sz w:val="20"/>
         </w:rPr>
-        <w:t>3</w:t>
+        <w:t>1</w:t>
       </w:r>
       <w:r>
         <w:rPr>
@@ -6178,21 +6497,21 @@
           <w:rFonts w:ascii="Futura Medium" w:hAnsi="Futura Medium" w:cs="Futura Medium"/>
           <w:sz w:val="20"/>
         </w:rPr>
-        <w:t>2</w:t>
-      </w:r>
-      <w:r>
-        <w:rPr>
-          <w:rFonts w:ascii="Futura Medium" w:hAnsi="Futura Medium" w:cs="Futura Medium"/>
-          <w:sz w:val="20"/>
-        </w:rPr>
-        <w:t>1, p. 19, ll. 1</w:t>
-      </w:r>
-      <w:r>
-        <w:rPr>
-          <w:rFonts w:ascii="Futura Medium" w:hAnsi="Futura Medium" w:cs="Futura Medium"/>
-          <w:sz w:val="20"/>
-        </w:rPr>
-        <w:t>2</w:t>
+        <w:t>18</w:t>
+      </w:r>
+      <w:r>
+        <w:rPr>
+          <w:rFonts w:ascii="Futura Medium" w:hAnsi="Futura Medium" w:cs="Futura Medium"/>
+          <w:sz w:val="20"/>
+        </w:rPr>
+        <w:t xml:space="preserve">, p. 19, ll. </w:t>
+      </w:r>
+      <w:r>
+        <w:rPr>
+          <w:rFonts w:ascii="Futura Medium" w:hAnsi="Futura Medium" w:cs="Futura Medium"/>
+          <w:sz w:val="20"/>
+        </w:rPr>
+        <w:t>8</w:t>
       </w:r>
       <w:r>
         <w:rPr>
@@ -6231,7 +6550,6 @@
           <w:color w:val="808080" w:themeColor="background1" w:themeShade="80"/>
           <w:sz w:val="20"/>
         </w:rPr>
-        <w:lastRenderedPageBreak/>
         <w:br/>
         <w:t>In summary, very good idea and interesting approach, but the underlying mechanisms should be explored more in-depth, which probably can be achieved by a more extensive literature study, especially of the physiological characteristics of these macrophytes.</w:t>
       </w:r>
@@ -6572,6 +6890,132 @@
           <w:rFonts w:ascii="Futura Medium" w:hAnsi="Futura Medium" w:cs="Futura Medium"/>
           <w:sz w:val="20"/>
         </w:rPr>
+        <w:t xml:space="preserve"> (</w:t>
+      </w:r>
+      <w:r>
+        <w:rPr>
+          <w:rFonts w:ascii="Futura Medium" w:hAnsi="Futura Medium" w:cs="Futura Medium"/>
+          <w:sz w:val="20"/>
+        </w:rPr>
+        <w:t>p. 7, ll. 2, 4f., 11–15, 17, 22, p. 10, l. 3, p. 11, ll. 20ff., p. 12, ll. 11, 14–20, p. 13, ll. 1ff., p. 15, ll. 16, 19f.)</w:t>
+      </w:r>
+      <w:r>
+        <w:rPr>
+          <w:rFonts w:ascii="Futura Medium" w:hAnsi="Futura Medium" w:cs="Futura Medium"/>
+          <w:sz w:val="20"/>
+        </w:rPr>
+        <w:t xml:space="preserve">. </w:t>
+      </w:r>
+      <w:r>
+        <w:rPr>
+          <w:rFonts w:ascii="Futura Medium" w:hAnsi="Futura Medium" w:cs="Futura Medium"/>
+          <w:sz w:val="20"/>
+        </w:rPr>
+        <w:t>I am a native English speaker.</w:t>
+      </w:r>
+    </w:p>
+    <w:p>
+      <w:pPr>
+        <w:jc w:val="left"/>
+        <w:rPr>
+          <w:rFonts w:ascii="Futura Medium" w:hAnsi="Futura Medium" w:cs="Futura Medium"/>
+          <w:color w:val="808080" w:themeColor="background1" w:themeShade="80"/>
+          <w:sz w:val="20"/>
+        </w:rPr>
+      </w:pPr>
+    </w:p>
+    <w:p>
+      <w:pPr>
+        <w:jc w:val="left"/>
+        <w:rPr>
+          <w:rFonts w:ascii="Futura Medium" w:hAnsi="Futura Medium" w:cs="Futura Medium"/>
+          <w:color w:val="808080" w:themeColor="background1" w:themeShade="80"/>
+          <w:sz w:val="20"/>
+        </w:rPr>
+      </w:pPr>
+      <w:proofErr w:type="gramStart"/>
+      <w:r>
+        <w:rPr>
+          <w:rFonts w:ascii="Futura Medium" w:hAnsi="Futura Medium" w:cs="Futura Medium" w:hint="cs"/>
+          <w:color w:val="808080" w:themeColor="background1" w:themeShade="80"/>
+          <w:sz w:val="20"/>
+        </w:rPr>
+        <w:t>At the moment</w:t>
+      </w:r>
+      <w:proofErr w:type="gramEnd"/>
+      <w:r>
+        <w:rPr>
+          <w:rFonts w:ascii="Futura Medium" w:hAnsi="Futura Medium" w:cs="Futura Medium" w:hint="cs"/>
+          <w:color w:val="808080" w:themeColor="background1" w:themeShade="80"/>
+          <w:sz w:val="20"/>
+        </w:rPr>
+        <w:t xml:space="preserve">, it seems that the goal of the study does not match with the experiment performed and the analyses done: the goal was to understand how persistent physiological activity in living fragments of seagrasses delay the decomposition of these fragments. However, as it is written now, my understanding is that this study cannot investigate this aspect but rather it </w:t>
+      </w:r>
+      <w:proofErr w:type="gramStart"/>
+      <w:r>
+        <w:rPr>
+          <w:rFonts w:ascii="Futura Medium" w:hAnsi="Futura Medium" w:cs="Futura Medium" w:hint="cs"/>
+          <w:color w:val="808080" w:themeColor="background1" w:themeShade="80"/>
+          <w:sz w:val="20"/>
+        </w:rPr>
+        <w:t>unravel</w:t>
+      </w:r>
+      <w:proofErr w:type="gramEnd"/>
+      <w:r>
+        <w:rPr>
+          <w:rFonts w:ascii="Futura Medium" w:hAnsi="Futura Medium" w:cs="Futura Medium" w:hint="cs"/>
+          <w:color w:val="808080" w:themeColor="background1" w:themeShade="80"/>
+          <w:sz w:val="20"/>
+        </w:rPr>
+        <w:t xml:space="preserve"> how long seagrass fragments can survive (</w:t>
+      </w:r>
+      <w:proofErr w:type="spellStart"/>
+      <w:r>
+        <w:rPr>
+          <w:rFonts w:ascii="Futura Medium" w:hAnsi="Futura Medium" w:cs="Futura Medium" w:hint="cs"/>
+          <w:color w:val="808080" w:themeColor="background1" w:themeShade="80"/>
+          <w:sz w:val="20"/>
+        </w:rPr>
+        <w:t>i.e</w:t>
+      </w:r>
+      <w:proofErr w:type="spellEnd"/>
+      <w:r>
+        <w:rPr>
+          <w:rFonts w:ascii="Futura Medium" w:hAnsi="Futura Medium" w:cs="Futura Medium" w:hint="cs"/>
+          <w:color w:val="808080" w:themeColor="background1" w:themeShade="80"/>
+          <w:sz w:val="20"/>
+        </w:rPr>
+        <w:t>, doing photosynthesis).  </w:t>
+      </w:r>
+      <w:r>
+        <w:rPr>
+          <w:rFonts w:ascii="Futura Medium" w:hAnsi="Futura Medium" w:cs="Futura Medium" w:hint="cs"/>
+          <w:color w:val="808080" w:themeColor="background1" w:themeShade="80"/>
+          <w:sz w:val="20"/>
+        </w:rPr>
+        <w:br/>
+      </w:r>
+    </w:p>
+    <w:p>
+      <w:pPr>
+        <w:jc w:val="left"/>
+        <w:rPr>
+          <w:rFonts w:ascii="Futura Medium" w:hAnsi="Futura Medium" w:cs="Futura Medium"/>
+          <w:sz w:val="20"/>
+        </w:rPr>
+      </w:pPr>
+      <w:r>
+        <w:rPr>
+          <w:rFonts w:ascii="Futura Medium" w:hAnsi="Futura Medium" w:cs="Futura Medium"/>
+          <w:sz w:val="20"/>
+        </w:rPr>
+        <w:t>The goal of the study</w:t>
+      </w:r>
+      <w:r>
+        <w:rPr>
+          <w:rFonts w:ascii="Futura Medium" w:hAnsi="Futura Medium" w:cs="Futura Medium"/>
+          <w:sz w:val="20"/>
+        </w:rPr>
         <w:t xml:space="preserve"> </w:t>
       </w:r>
       <w:r>
@@ -6579,7 +7023,63 @@
           <w:rFonts w:ascii="Futura Medium" w:hAnsi="Futura Medium" w:cs="Futura Medium"/>
           <w:sz w:val="20"/>
         </w:rPr>
-        <w:t>(p. 7, ll. 2, 4f., 11–15, 17, 22, p. 10, l. 3, p. 12, ll. 16–22, p. 13, ll. 3ff.)</w:t>
+        <w:t xml:space="preserve">is to </w:t>
+      </w:r>
+      <w:r>
+        <w:rPr>
+          <w:rFonts w:ascii="Futura Medium" w:hAnsi="Futura Medium" w:cs="Futura Medium"/>
+          <w:sz w:val="20"/>
+        </w:rPr>
+        <w:t>quantify</w:t>
+      </w:r>
+      <w:r>
+        <w:rPr>
+          <w:rFonts w:ascii="Futura Medium" w:hAnsi="Futura Medium" w:cs="Futura Medium"/>
+          <w:sz w:val="20"/>
+        </w:rPr>
+        <w:t xml:space="preserve"> detrital photosynthesis </w:t>
+      </w:r>
+      <w:r>
+        <w:rPr>
+          <w:rFonts w:ascii="Futura Medium" w:hAnsi="Futura Medium" w:cs="Futura Medium"/>
+          <w:sz w:val="20"/>
+        </w:rPr>
+        <w:t>across plant lineages</w:t>
+      </w:r>
+      <w:r>
+        <w:rPr>
+          <w:rFonts w:ascii="Futura Medium" w:hAnsi="Futura Medium" w:cs="Futura Medium"/>
+          <w:sz w:val="20"/>
+        </w:rPr>
+        <w:t xml:space="preserve"> to get a better understanding of how different we expect the influence of </w:t>
+      </w:r>
+      <w:r>
+        <w:rPr>
+          <w:rFonts w:ascii="Futura Medium" w:hAnsi="Futura Medium" w:cs="Futura Medium"/>
+          <w:sz w:val="20"/>
+        </w:rPr>
+        <w:t>physiology</w:t>
+      </w:r>
+      <w:r>
+        <w:rPr>
+          <w:rFonts w:ascii="Futura Medium" w:hAnsi="Futura Medium" w:cs="Futura Medium"/>
+          <w:sz w:val="20"/>
+        </w:rPr>
+        <w:t xml:space="preserve"> on detrital dynamics to be in seaweeds compared to other plants, which in turn helps us re</w:t>
+      </w:r>
+      <w:r>
+        <w:rPr>
+          <w:rFonts w:ascii="Futura Medium" w:hAnsi="Futura Medium" w:cs="Futura Medium"/>
+          <w:sz w:val="20"/>
+        </w:rPr>
+        <w:t>-</w:t>
+      </w:r>
+      <w:r>
+        <w:rPr>
+          <w:rFonts w:ascii="Futura Medium" w:hAnsi="Futura Medium" w:cs="Futura Medium"/>
+          <w:sz w:val="20"/>
+        </w:rPr>
+        <w:t>evaluate existing seaweed decomposition experiments</w:t>
       </w:r>
       <w:r>
         <w:rPr>
@@ -6593,188 +7093,6 @@
           <w:rFonts w:ascii="Futura Medium" w:hAnsi="Futura Medium" w:cs="Futura Medium"/>
           <w:sz w:val="20"/>
         </w:rPr>
-        <w:t>I am a native English speaker.</w:t>
-      </w:r>
-    </w:p>
-    <w:p>
-      <w:pPr>
-        <w:jc w:val="left"/>
-        <w:rPr>
-          <w:rFonts w:ascii="Futura Medium" w:hAnsi="Futura Medium" w:cs="Futura Medium"/>
-          <w:color w:val="808080" w:themeColor="background1" w:themeShade="80"/>
-          <w:sz w:val="20"/>
-        </w:rPr>
-      </w:pPr>
-    </w:p>
-    <w:p>
-      <w:pPr>
-        <w:jc w:val="left"/>
-        <w:rPr>
-          <w:rFonts w:ascii="Futura Medium" w:hAnsi="Futura Medium" w:cs="Futura Medium"/>
-          <w:color w:val="808080" w:themeColor="background1" w:themeShade="80"/>
-          <w:sz w:val="20"/>
-        </w:rPr>
-      </w:pPr>
-      <w:proofErr w:type="gramStart"/>
-      <w:r>
-        <w:rPr>
-          <w:rFonts w:ascii="Futura Medium" w:hAnsi="Futura Medium" w:cs="Futura Medium" w:hint="cs"/>
-          <w:color w:val="808080" w:themeColor="background1" w:themeShade="80"/>
-          <w:sz w:val="20"/>
-        </w:rPr>
-        <w:t>At the moment</w:t>
-      </w:r>
-      <w:proofErr w:type="gramEnd"/>
-      <w:r>
-        <w:rPr>
-          <w:rFonts w:ascii="Futura Medium" w:hAnsi="Futura Medium" w:cs="Futura Medium" w:hint="cs"/>
-          <w:color w:val="808080" w:themeColor="background1" w:themeShade="80"/>
-          <w:sz w:val="20"/>
-        </w:rPr>
-        <w:t xml:space="preserve">, it seems that the goal of the study does not match with the experiment performed and the analyses done: the goal was to understand how persistent physiological activity in living fragments of seagrasses delay the decomposition of these fragments. However, as it is written now, my understanding is that this study cannot investigate this aspect but rather it </w:t>
-      </w:r>
-      <w:proofErr w:type="gramStart"/>
-      <w:r>
-        <w:rPr>
-          <w:rFonts w:ascii="Futura Medium" w:hAnsi="Futura Medium" w:cs="Futura Medium" w:hint="cs"/>
-          <w:color w:val="808080" w:themeColor="background1" w:themeShade="80"/>
-          <w:sz w:val="20"/>
-        </w:rPr>
-        <w:t>unravel</w:t>
-      </w:r>
-      <w:proofErr w:type="gramEnd"/>
-      <w:r>
-        <w:rPr>
-          <w:rFonts w:ascii="Futura Medium" w:hAnsi="Futura Medium" w:cs="Futura Medium" w:hint="cs"/>
-          <w:color w:val="808080" w:themeColor="background1" w:themeShade="80"/>
-          <w:sz w:val="20"/>
-        </w:rPr>
-        <w:t xml:space="preserve"> how long seagrass fragments can survive (</w:t>
-      </w:r>
-      <w:proofErr w:type="spellStart"/>
-      <w:r>
-        <w:rPr>
-          <w:rFonts w:ascii="Futura Medium" w:hAnsi="Futura Medium" w:cs="Futura Medium" w:hint="cs"/>
-          <w:color w:val="808080" w:themeColor="background1" w:themeShade="80"/>
-          <w:sz w:val="20"/>
-        </w:rPr>
-        <w:t>i.e</w:t>
-      </w:r>
-      <w:proofErr w:type="spellEnd"/>
-      <w:r>
-        <w:rPr>
-          <w:rFonts w:ascii="Futura Medium" w:hAnsi="Futura Medium" w:cs="Futura Medium" w:hint="cs"/>
-          <w:color w:val="808080" w:themeColor="background1" w:themeShade="80"/>
-          <w:sz w:val="20"/>
-        </w:rPr>
-        <w:t>, doing photosynthesis).  </w:t>
-      </w:r>
-      <w:r>
-        <w:rPr>
-          <w:rFonts w:ascii="Futura Medium" w:hAnsi="Futura Medium" w:cs="Futura Medium" w:hint="cs"/>
-          <w:color w:val="808080" w:themeColor="background1" w:themeShade="80"/>
-          <w:sz w:val="20"/>
-        </w:rPr>
-        <w:br/>
-      </w:r>
-    </w:p>
-    <w:p>
-      <w:pPr>
-        <w:jc w:val="left"/>
-        <w:rPr>
-          <w:rFonts w:ascii="Futura Medium" w:hAnsi="Futura Medium" w:cs="Futura Medium"/>
-          <w:sz w:val="20"/>
-        </w:rPr>
-      </w:pPr>
-      <w:r>
-        <w:rPr>
-          <w:rFonts w:ascii="Futura Medium" w:hAnsi="Futura Medium" w:cs="Futura Medium"/>
-          <w:sz w:val="20"/>
-        </w:rPr>
-        <w:t>The goal of the study</w:t>
-      </w:r>
-      <w:r>
-        <w:rPr>
-          <w:rFonts w:ascii="Futura Medium" w:hAnsi="Futura Medium" w:cs="Futura Medium"/>
-          <w:sz w:val="20"/>
-        </w:rPr>
-        <w:t xml:space="preserve"> </w:t>
-      </w:r>
-      <w:r>
-        <w:rPr>
-          <w:rFonts w:ascii="Futura Medium" w:hAnsi="Futura Medium" w:cs="Futura Medium"/>
-          <w:sz w:val="20"/>
-        </w:rPr>
-        <w:t xml:space="preserve">is to </w:t>
-      </w:r>
-      <w:r>
-        <w:rPr>
-          <w:rFonts w:ascii="Futura Medium" w:hAnsi="Futura Medium" w:cs="Futura Medium"/>
-          <w:sz w:val="20"/>
-        </w:rPr>
-        <w:t>quantify</w:t>
-      </w:r>
-      <w:r>
-        <w:rPr>
-          <w:rFonts w:ascii="Futura Medium" w:hAnsi="Futura Medium" w:cs="Futura Medium"/>
-          <w:sz w:val="20"/>
-        </w:rPr>
-        <w:t xml:space="preserve"> detrital photosynthesis </w:t>
-      </w:r>
-      <w:r>
-        <w:rPr>
-          <w:rFonts w:ascii="Futura Medium" w:hAnsi="Futura Medium" w:cs="Futura Medium"/>
-          <w:sz w:val="20"/>
-        </w:rPr>
-        <w:t>across plant lineages</w:t>
-      </w:r>
-      <w:r>
-        <w:rPr>
-          <w:rFonts w:ascii="Futura Medium" w:hAnsi="Futura Medium" w:cs="Futura Medium"/>
-          <w:sz w:val="20"/>
-        </w:rPr>
-        <w:t xml:space="preserve"> to get a better understanding of how different we expect the influence of </w:t>
-      </w:r>
-      <w:r>
-        <w:rPr>
-          <w:rFonts w:ascii="Futura Medium" w:hAnsi="Futura Medium" w:cs="Futura Medium"/>
-          <w:sz w:val="20"/>
-        </w:rPr>
-        <w:t>physiology</w:t>
-      </w:r>
-      <w:r>
-        <w:rPr>
-          <w:rFonts w:ascii="Futura Medium" w:hAnsi="Futura Medium" w:cs="Futura Medium"/>
-          <w:sz w:val="20"/>
-        </w:rPr>
-        <w:t xml:space="preserve"> on detrital dynamics to be in seaweeds compared to other plants, which in turn helps us re</w:t>
-      </w:r>
-      <w:r>
-        <w:rPr>
-          <w:rFonts w:ascii="Futura Medium" w:hAnsi="Futura Medium" w:cs="Futura Medium"/>
-          <w:sz w:val="20"/>
-        </w:rPr>
-        <w:t>-</w:t>
-      </w:r>
-      <w:r>
-        <w:rPr>
-          <w:rFonts w:ascii="Futura Medium" w:hAnsi="Futura Medium" w:cs="Futura Medium"/>
-          <w:sz w:val="20"/>
-        </w:rPr>
-        <w:t>evaluate existing seaweed decomposition experiments</w:t>
-      </w:r>
-      <w:r>
-        <w:rPr>
-          <w:rFonts w:ascii="Futura Medium" w:hAnsi="Futura Medium" w:cs="Futura Medium"/>
-          <w:sz w:val="20"/>
-        </w:rPr>
-        <w:t xml:space="preserve">. </w:t>
-      </w:r>
-      <w:r>
-        <w:rPr>
-          <w:rFonts w:ascii="Futura Medium" w:hAnsi="Futura Medium" w:cs="Futura Medium"/>
-          <w:sz w:val="20"/>
-        </w:rPr>
         <w:t xml:space="preserve">I never mention that I aim to quantify the delay in decomposition on a mass basis. I have clarified the aims </w:t>
       </w:r>
       <w:r>
@@ -6835,6 +7153,7 @@
           <w:color w:val="808080" w:themeColor="background1" w:themeShade="80"/>
           <w:sz w:val="20"/>
         </w:rPr>
+        <w:lastRenderedPageBreak/>
         <w:br/>
         <w:t>Specific comments</w:t>
       </w:r>
@@ -6845,16 +7164,7 @@
           <w:sz w:val="20"/>
         </w:rPr>
         <w:br/>
-        <w:t xml:space="preserve">Abstract - I think the transition between the background and the methods needs improvement. From the background I expected that the study would have focused on seaweeds, yet, in the methods I </w:t>
-      </w:r>
-      <w:r>
-        <w:rPr>
-          <w:rFonts w:ascii="Futura Medium" w:hAnsi="Futura Medium" w:cs="Futura Medium" w:hint="cs"/>
-          <w:color w:val="808080" w:themeColor="background1" w:themeShade="80"/>
-          <w:sz w:val="20"/>
-        </w:rPr>
-        <w:lastRenderedPageBreak/>
-        <w:t xml:space="preserve">discovered that </w:t>
+        <w:t xml:space="preserve">Abstract - I think the transition between the background and the methods needs improvement. From the background I expected that the study would have focused on seaweeds, yet, in the methods I discovered that </w:t>
       </w:r>
       <w:proofErr w:type="gramStart"/>
       <w:r>
@@ -7105,7 +7415,14 @@
           <w:rFonts w:ascii="Futura Medium" w:hAnsi="Futura Medium" w:cs="Futura Medium"/>
           <w:sz w:val="20"/>
         </w:rPr>
-        <w:t xml:space="preserve">This is a purely semantic issue. In my manuscript I quote the traditional definition of detritus because I question it. </w:t>
+        <w:t>I believe this</w:t>
+      </w:r>
+      <w:r>
+        <w:rPr>
+          <w:rFonts w:ascii="Futura Medium" w:hAnsi="Futura Medium" w:cs="Futura Medium"/>
+          <w:sz w:val="20"/>
+        </w:rPr>
+        <w:t xml:space="preserve"> is a purely semantic issue. In my manuscript I quote the traditional definition of detritus because I question it. </w:t>
       </w:r>
       <w:r>
         <w:rPr>
@@ -7702,6 +8019,7 @@
           <w:rFonts w:ascii="Futura Medium" w:hAnsi="Futura Medium" w:cs="Futura Medium"/>
           <w:sz w:val="20"/>
         </w:rPr>
+        <w:lastRenderedPageBreak/>
         <w:t>“For lack of a better word” is exactly my point. I propose that we simply stick with detritus.</w:t>
       </w:r>
       <w:r>
@@ -7776,7 +8094,6 @@
           <w:color w:val="808080" w:themeColor="background1" w:themeShade="80"/>
           <w:sz w:val="20"/>
         </w:rPr>
-        <w:lastRenderedPageBreak/>
         <w:br/>
         <w:t xml:space="preserve">Page 6, line 10 - Many more details on the methods are needed. For instance, from where the sediment placed in the tank has been collected? Is the same sediment for both seagrass species? Has A. </w:t>
       </w:r>
@@ -8165,21 +8482,7 @@
           <w:rFonts w:ascii="Futura Medium" w:hAnsi="Futura Medium" w:cs="Futura Medium"/>
           <w:sz w:val="20"/>
         </w:rPr>
-        <w:t xml:space="preserve">so cannot succinctly </w:t>
-      </w:r>
-      <w:r>
-        <w:rPr>
-          <w:rFonts w:ascii="Futura Medium" w:hAnsi="Futura Medium" w:cs="Futura Medium"/>
-          <w:sz w:val="20"/>
-        </w:rPr>
-        <w:t xml:space="preserve">be </w:t>
-      </w:r>
-      <w:r>
-        <w:rPr>
-          <w:rFonts w:ascii="Futura Medium" w:hAnsi="Futura Medium" w:cs="Futura Medium"/>
-          <w:sz w:val="20"/>
-        </w:rPr>
-        <w:t xml:space="preserve">put into words </w:t>
+        <w:t xml:space="preserve">so cannot succinctly be put into words </w:t>
       </w:r>
       <w:r>
         <w:rPr>
@@ -8540,6 +8843,7 @@
           <w:rFonts w:ascii="Futura Medium" w:hAnsi="Futura Medium" w:cs="Futura Medium"/>
           <w:sz w:val="20"/>
         </w:rPr>
+        <w:lastRenderedPageBreak/>
         <w:t xml:space="preserve">In the previous paragraph I clearly state that I use </w:t>
       </w:r>
       <w:r>
@@ -8633,22 +8937,42 @@
           <w:rFonts w:ascii="Futura Medium" w:hAnsi="Futura Medium" w:cs="Futura Medium"/>
           <w:sz w:val="20"/>
         </w:rPr>
-        <w:t xml:space="preserve"> </w:t>
-      </w:r>
-      <w:r>
-        <w:rPr>
-          <w:rFonts w:ascii="Futura Medium" w:hAnsi="Futura Medium" w:cs="Futura Medium"/>
-          <w:sz w:val="20"/>
-        </w:rPr>
-        <w:lastRenderedPageBreak/>
-        <w:t>distributions of beta contain information about uncertainty which central tendencies such as coefficients do not.</w:t>
-      </w:r>
-      <w:r>
-        <w:rPr>
-          <w:rFonts w:ascii="Futura Medium" w:hAnsi="Futura Medium" w:cs="Futura Medium"/>
-          <w:sz w:val="20"/>
-        </w:rPr>
-        <w:t xml:space="preserve"> I mention that I propagate this uncertainty through my models (p. 12, ll. 4–9)</w:t>
+        <w:t xml:space="preserve"> distributions of beta contain information about uncertainty which central tendencies such as coefficients do not.</w:t>
+      </w:r>
+      <w:r>
+        <w:rPr>
+          <w:rFonts w:ascii="Futura Medium" w:hAnsi="Futura Medium" w:cs="Futura Medium"/>
+          <w:sz w:val="20"/>
+        </w:rPr>
+        <w:t xml:space="preserve"> I mention that I propagate this uncertainty through my models (p. 12, ll. </w:t>
+      </w:r>
+      <w:r>
+        <w:rPr>
+          <w:rFonts w:ascii="Futura Medium" w:hAnsi="Futura Medium" w:cs="Futura Medium"/>
+          <w:sz w:val="20"/>
+        </w:rPr>
+        <w:t>2</w:t>
+      </w:r>
+      <w:r>
+        <w:rPr>
+          <w:rFonts w:ascii="Futura Medium" w:hAnsi="Futura Medium" w:cs="Futura Medium"/>
+          <w:sz w:val="20"/>
+        </w:rPr>
+        <w:t>–</w:t>
+      </w:r>
+      <w:r>
+        <w:rPr>
+          <w:rFonts w:ascii="Futura Medium" w:hAnsi="Futura Medium" w:cs="Futura Medium"/>
+          <w:sz w:val="20"/>
+        </w:rPr>
+        <w:t>7</w:t>
+      </w:r>
+      <w:r>
+        <w:rPr>
+          <w:rFonts w:ascii="Futura Medium" w:hAnsi="Futura Medium" w:cs="Futura Medium"/>
+          <w:sz w:val="20"/>
+        </w:rPr>
+        <w:t>)</w:t>
       </w:r>
       <w:r>
         <w:rPr>
@@ -8933,7 +9257,21 @@
           <w:rFonts w:ascii="Futura Medium" w:hAnsi="Futura Medium" w:cs="Futura Medium"/>
           <w:sz w:val="20"/>
         </w:rPr>
-        <w:t xml:space="preserve"> and as has been done before (Wright et al. </w:t>
+        <w:t xml:space="preserve"> and as has been done before</w:t>
+      </w:r>
+      <w:r>
+        <w:rPr>
+          <w:rFonts w:ascii="Futura Medium" w:hAnsi="Futura Medium" w:cs="Futura Medium"/>
+          <w:sz w:val="20"/>
+        </w:rPr>
+        <w:t xml:space="preserve"> by papers I cite</w:t>
+      </w:r>
+      <w:r>
+        <w:rPr>
+          <w:rFonts w:ascii="Futura Medium" w:hAnsi="Futura Medium" w:cs="Futura Medium"/>
+          <w:sz w:val="20"/>
+        </w:rPr>
+        <w:t xml:space="preserve"> (Wright et al. </w:t>
       </w:r>
       <w:r>
         <w:rPr>
@@ -8948,6 +9286,13 @@
           <w:sz w:val="20"/>
         </w:rPr>
         <w:t>2024)</w:t>
+      </w:r>
+      <w:r>
+        <w:rPr>
+          <w:rFonts w:ascii="Futura Medium" w:hAnsi="Futura Medium" w:cs="Futura Medium"/>
+          <w:sz w:val="20"/>
+        </w:rPr>
+        <w:t xml:space="preserve"> and many others</w:t>
       </w:r>
       <w:r>
         <w:rPr>
@@ -9147,6 +9492,7 @@
           <w:rFonts w:ascii="Futura Medium" w:hAnsi="Futura Medium" w:cs="Futura Medium"/>
           <w:sz w:val="20"/>
         </w:rPr>
+        <w:lastRenderedPageBreak/>
         <w:t xml:space="preserve">I have removed “community” as it evidently caused confusion (p. 10, l. 1). Tau simply parameterises the net oxygen consumption on dead detritus. I did not measure dark </w:t>
       </w:r>
       <w:proofErr w:type="gramStart"/>
@@ -9687,7 +10033,63 @@
           <w:rFonts w:ascii="Futura Medium" w:hAnsi="Futura Medium" w:cs="Futura Medium"/>
           <w:sz w:val="20"/>
         </w:rPr>
-        <w:t>, although I do present these data in the seagrass results</w:t>
+        <w:t xml:space="preserve">, although I do present these data </w:t>
+      </w:r>
+      <w:r>
+        <w:rPr>
+          <w:rFonts w:ascii="Futura Medium" w:hAnsi="Futura Medium" w:cs="Futura Medium"/>
+          <w:sz w:val="20"/>
+        </w:rPr>
+        <w:t xml:space="preserve">as a side note </w:t>
+      </w:r>
+      <w:r>
+        <w:rPr>
+          <w:rFonts w:ascii="Futura Medium" w:hAnsi="Futura Medium" w:cs="Futura Medium"/>
+          <w:sz w:val="20"/>
+        </w:rPr>
+        <w:t>in the seagrass results</w:t>
+      </w:r>
+      <w:r>
+        <w:rPr>
+          <w:rFonts w:ascii="Futura Medium" w:hAnsi="Futura Medium" w:cs="Futura Medium"/>
+          <w:sz w:val="20"/>
+        </w:rPr>
+        <w:t xml:space="preserve"> (p. </w:t>
+      </w:r>
+      <w:r>
+        <w:rPr>
+          <w:rFonts w:ascii="Futura Medium" w:hAnsi="Futura Medium" w:cs="Futura Medium"/>
+          <w:sz w:val="20"/>
+        </w:rPr>
+        <w:t xml:space="preserve">16, </w:t>
+      </w:r>
+      <w:r>
+        <w:rPr>
+          <w:rFonts w:ascii="Futura Medium" w:hAnsi="Futura Medium" w:cs="Futura Medium"/>
+          <w:sz w:val="20"/>
+        </w:rPr>
+        <w:t xml:space="preserve">ll. </w:t>
+      </w:r>
+      <w:r>
+        <w:rPr>
+          <w:rFonts w:ascii="Futura Medium" w:hAnsi="Futura Medium" w:cs="Futura Medium"/>
+          <w:sz w:val="20"/>
+        </w:rPr>
+        <w:t>13–</w:t>
+      </w:r>
+      <w:r>
+        <w:rPr>
+          <w:rFonts w:ascii="Futura Medium" w:hAnsi="Futura Medium" w:cs="Futura Medium"/>
+          <w:sz w:val="20"/>
+        </w:rPr>
+        <w:t>17</w:t>
+      </w:r>
+      <w:r>
+        <w:rPr>
+          <w:rFonts w:ascii="Futura Medium" w:hAnsi="Futura Medium" w:cs="Futura Medium"/>
+          <w:sz w:val="20"/>
+        </w:rPr>
+        <w:t>)</w:t>
       </w:r>
       <w:r>
         <w:rPr>
@@ -9701,6 +10103,13 @@
           <w:rFonts w:ascii="Futura Medium" w:hAnsi="Futura Medium" w:cs="Futura Medium"/>
           <w:sz w:val="20"/>
         </w:rPr>
+        <w:t xml:space="preserve">primarily </w:t>
+      </w:r>
+      <w:r>
+        <w:rPr>
+          <w:rFonts w:ascii="Futura Medium" w:hAnsi="Futura Medium" w:cs="Futura Medium"/>
+          <w:sz w:val="20"/>
+        </w:rPr>
         <w:t>estimating</w:t>
       </w:r>
       <w:r>
@@ -9729,7 +10138,35 @@
           <w:rFonts w:ascii="Futura Medium" w:hAnsi="Futura Medium" w:cs="Futura Medium"/>
           <w:sz w:val="20"/>
         </w:rPr>
-        <w:t xml:space="preserve"> I have added a definition (p. 4, ll. 4f.).</w:t>
+        <w:t xml:space="preserve"> I have added </w:t>
+      </w:r>
+      <w:r>
+        <w:rPr>
+          <w:rFonts w:ascii="Futura Medium" w:hAnsi="Futura Medium" w:cs="Futura Medium"/>
+          <w:sz w:val="20"/>
+        </w:rPr>
+        <w:t>this</w:t>
+      </w:r>
+      <w:r>
+        <w:rPr>
+          <w:rFonts w:ascii="Futura Medium" w:hAnsi="Futura Medium" w:cs="Futura Medium"/>
+          <w:sz w:val="20"/>
+        </w:rPr>
+        <w:t xml:space="preserve"> definition</w:t>
+      </w:r>
+      <w:r>
+        <w:rPr>
+          <w:rFonts w:ascii="Futura Medium" w:hAnsi="Futura Medium" w:cs="Futura Medium"/>
+          <w:sz w:val="20"/>
+        </w:rPr>
+        <w:t xml:space="preserve"> to avoid further misunderstandings</w:t>
+      </w:r>
+      <w:r>
+        <w:rPr>
+          <w:rFonts w:ascii="Futura Medium" w:hAnsi="Futura Medium" w:cs="Futura Medium"/>
+          <w:sz w:val="20"/>
+        </w:rPr>
+        <w:t xml:space="preserve"> (p. 4, ll. 4f.).</w:t>
       </w:r>
     </w:p>
     <w:p>

</xml_diff>